<commit_message>
Quitar logo del colegio de la portada del informe
Co-Authored-By: Claude Sonnet 5.5 <noreply@anthropic.com>
Claude-Session: https://claude.ai/code/session_01QEW7T5uhcfHuA4XbGndkeT
</commit_message>
<xml_diff>
--- a/Informe_EventosIDETH.docx
+++ b/Informe_EventosIDETH.docx
@@ -25,46 +25,6 @@
                   </pic:nvPicPr>
                   <pic:blipFill>
                     <a:blip r:embed="rId8"/>
-                    <a:stretch>
-                      <a:fillRect/>
-                    </a:stretch>
-                  </pic:blipFill>
-                  <pic:spPr>
-                    <a:xfrm>
-                      <a:off x="0" y="0"/>
-                      <a:ext cx="1143000" cy="1143000"/>
-                    </a:xfrm>
-                    <a:prstGeom prst="rect">
-                      <a:avLst/>
-                    </a:prstGeom>
-                  </pic:spPr>
-                </pic:pic>
-              </a:graphicData>
-            </a:graphic>
-          </wp:inline>
-        </w:drawing>
-      </w:r>
-      <w:r>
-        <w:t xml:space="preserve">          </w:t>
-      </w:r>
-      <w:r>
-        <w:drawing>
-          <wp:inline distT="0" distB="0" distL="0" distR="0">
-            <wp:extent cx="1143000" cy="1143000"/>
-            <wp:effectExtent t="0" r="0" b="0" l="0"/>
-            <wp:docPr id="102" name="Logo 2" descr="Logo I.E.D. Técnica para el Desarrollo del Talento Humano"/>
-            <wp:cNvGraphicFramePr>
-              <a:graphicFrameLocks xmlns:a="http://schemas.openxmlformats.org/drawingml/2006/main" noChangeAspect="1"/>
-            </wp:cNvGraphicFramePr>
-            <a:graphic xmlns:a="http://schemas.openxmlformats.org/drawingml/2006/main">
-              <a:graphicData uri="http://schemas.openxmlformats.org/drawingml/2006/picture">
-                <pic:pic xmlns:pic="http://schemas.openxmlformats.org/drawingml/2006/picture">
-                  <pic:nvPicPr>
-                    <pic:cNvPr id="102" name="Logo 2"/>
-                    <pic:cNvPicPr/>
-                  </pic:nvPicPr>
-                  <pic:blipFill>
-                    <a:blip r:embed="rId300"/>
                     <a:stretch>
                       <a:fillRect/>
                     </a:stretch>

</xml_diff>